<commit_message>
review doc: drop personal opening note, document now opens on the summary
</commit_message>
<xml_diff>
--- a/networking/nozzle-cad/nozzle_review.docx
+++ b/networking/nozzle-cad/nozzle_review.docx
@@ -37,14 +37,6 @@
         <w:pict>
           <v:rect style="width:0;height:1.5pt" o:hralign="center" o:hrstd="t" o:hr="t"/>
         </w:pict>
-      </w:r>
-    </w:p>
-    <w:p>
-      <w:pPr>
-        <w:pStyle w:val="FirstParagraph"/>
-      </w:pPr>
-      <w:r>
-        <w:t xml:space="preserve">Mama, thank you for sending the specification. I have gone through it in detail, checked the material and clinical questions you raised against published sources, and built CAD files so you can get a prototype quoted. This document is the result. The short version is that the concept is sound and worth building, the material choice is right, and there are two changes to the geometry I would make before spending money on parts.</w:t>
       </w:r>
     </w:p>
     <w:bookmarkStart w:id="20" w:name="summary"/>
@@ -607,7 +599,7 @@
               <a:graphicData uri="http://schemas.openxmlformats.org/drawingml/2006/picture">
                 <pic:pic>
                   <pic:nvPicPr>
-                    <pic:cNvPr descr="./section.png" id="27" name="Picture"/>
+                    <pic:cNvPr descr="section.png" id="27" name="Picture"/>
                     <pic:cNvPicPr>
                       <a:picLocks noChangeArrowheads="1" noChangeAspect="1"/>
                     </pic:cNvPicPr>
@@ -2071,7 +2063,7 @@
               <a:graphicData uri="http://schemas.openxmlformats.org/drawingml/2006/picture">
                 <pic:pic>
                   <pic:nvPicPr>
-                    <pic:cNvPr descr="./views_grid.png" id="41" name="Picture"/>
+                    <pic:cNvPr descr="views_grid.png" id="41" name="Picture"/>
                     <pic:cNvPicPr>
                       <a:picLocks noChangeArrowheads="1" noChangeAspect="1"/>
                     </pic:cNvPicPr>

</xml_diff>